<commit_message>
add more working files
</commit_message>
<xml_diff>
--- a/Informartion.docx
+++ b/Informartion.docx
@@ -4561,6 +4561,9 @@
         <w:pStyle w:val="NormalWeb"/>
       </w:pPr>
       <w:r>
+        <w:rPr>
+          <w:noProof/>
+        </w:rPr>
         <w:drawing>
           <wp:inline distT="0" distB="0" distL="0" distR="0" wp14:anchorId="6C42F321" wp14:editId="1B455901">
             <wp:extent cx="5731510" cy="2507536"/>
@@ -4611,6 +4614,9 @@
         <w:pStyle w:val="NormalWeb"/>
       </w:pPr>
       <w:r>
+        <w:rPr>
+          <w:noProof/>
+        </w:rPr>
         <w:drawing>
           <wp:inline distT="0" distB="0" distL="0" distR="0" wp14:anchorId="470EBF74" wp14:editId="22E83971">
             <wp:extent cx="5731510" cy="3785491"/>
@@ -4647,6 +4653,656 @@
           </wp:inline>
         </w:drawing>
       </w:r>
+    </w:p>
+    <w:p>
+      <w:pPr>
+        <w:pStyle w:val="NormalWeb"/>
+      </w:pPr>
+    </w:p>
+    <w:p>
+      <w:pPr>
+        <w:pStyle w:val="Heading1"/>
+      </w:pPr>
+    </w:p>
+    <w:p>
+      <w:pPr>
+        <w:pStyle w:val="Heading1"/>
+      </w:pPr>
+    </w:p>
+    <w:p>
+      <w:pPr>
+        <w:pStyle w:val="Heading1"/>
+      </w:pPr>
+      <w:r>
+        <w:lastRenderedPageBreak/>
+        <w:t>Repository layer:</w:t>
+      </w:r>
+      <w:r>
+        <w:t xml:space="preserve"> </w:t>
+      </w:r>
+      <w:r>
+        <w:t>Implementation Order</w:t>
+      </w:r>
+    </w:p>
+    <w:p>
+      <w:pPr>
+        <w:pStyle w:val="NormalWeb"/>
+      </w:pPr>
+      <w:r>
+        <w:t xml:space="preserve">So start coding in this </w:t>
+      </w:r>
+      <w:r>
+        <w:rPr>
+          <w:rStyle w:val="Strong"/>
+        </w:rPr>
+        <w:t>exact order</w:t>
+      </w:r>
+      <w:r>
+        <w:t>:</w:t>
+      </w:r>
+    </w:p>
+    <w:p>
+      <w:pPr>
+        <w:pStyle w:val="HTMLPreformatted"/>
+      </w:pPr>
+      <w:r>
+        <w:t>1️</w:t>
+      </w:r>
+      <w:r>
+        <w:rPr>
+          <w:rFonts w:ascii="Tahoma" w:hAnsi="Tahoma" w:cs="Tahoma"/>
+        </w:rPr>
+        <w:t>⃣</w:t>
+      </w:r>
+      <w:r>
+        <w:t xml:space="preserve"> </w:t>
+      </w:r>
+      <w:proofErr w:type="spellStart"/>
+      <w:r>
+        <w:t>DepartmentRepository</w:t>
+      </w:r>
+      <w:proofErr w:type="spellEnd"/>
+      <w:r>
+        <w:br/>
+        <w:t>2️</w:t>
+      </w:r>
+      <w:r>
+        <w:rPr>
+          <w:rFonts w:ascii="Tahoma" w:hAnsi="Tahoma" w:cs="Tahoma"/>
+        </w:rPr>
+        <w:t>⃣</w:t>
+      </w:r>
+      <w:r>
+        <w:t xml:space="preserve"> </w:t>
+      </w:r>
+      <w:proofErr w:type="spellStart"/>
+      <w:r>
+        <w:t>CourseRepository</w:t>
+      </w:r>
+      <w:proofErr w:type="spellEnd"/>
+      <w:r>
+        <w:br/>
+        <w:t>3️</w:t>
+      </w:r>
+      <w:r>
+        <w:rPr>
+          <w:rFonts w:ascii="Tahoma" w:hAnsi="Tahoma" w:cs="Tahoma"/>
+        </w:rPr>
+        <w:t>⃣</w:t>
+      </w:r>
+      <w:r>
+        <w:t xml:space="preserve"> </w:t>
+      </w:r>
+      <w:proofErr w:type="spellStart"/>
+      <w:r>
+        <w:t>SemesterRepository</w:t>
+      </w:r>
+      <w:proofErr w:type="spellEnd"/>
+      <w:r>
+        <w:br/>
+        <w:t>4️</w:t>
+      </w:r>
+      <w:r>
+        <w:rPr>
+          <w:rFonts w:ascii="Tahoma" w:hAnsi="Tahoma" w:cs="Tahoma"/>
+        </w:rPr>
+        <w:t>⃣</w:t>
+      </w:r>
+      <w:r>
+        <w:t xml:space="preserve"> </w:t>
+      </w:r>
+      <w:proofErr w:type="spellStart"/>
+      <w:r>
+        <w:t>SubjectRepository</w:t>
+      </w:r>
+      <w:proofErr w:type="spellEnd"/>
+      <w:r>
+        <w:br/>
+        <w:t>5️</w:t>
+      </w:r>
+      <w:r>
+        <w:rPr>
+          <w:rFonts w:ascii="Tahoma" w:hAnsi="Tahoma" w:cs="Tahoma"/>
+        </w:rPr>
+        <w:t>⃣</w:t>
+      </w:r>
+      <w:r>
+        <w:t xml:space="preserve"> </w:t>
+      </w:r>
+      <w:proofErr w:type="spellStart"/>
+      <w:r>
+        <w:t>StudentRepository</w:t>
+      </w:r>
+      <w:proofErr w:type="spellEnd"/>
+      <w:r>
+        <w:br/>
+        <w:t>6️</w:t>
+      </w:r>
+      <w:r>
+        <w:rPr>
+          <w:rFonts w:ascii="Tahoma" w:hAnsi="Tahoma" w:cs="Tahoma"/>
+        </w:rPr>
+        <w:t>⃣</w:t>
+      </w:r>
+      <w:r>
+        <w:t xml:space="preserve"> </w:t>
+      </w:r>
+      <w:proofErr w:type="spellStart"/>
+      <w:r>
+        <w:t>FacultyRepository</w:t>
+      </w:r>
+      <w:proofErr w:type="spellEnd"/>
+      <w:r>
+        <w:br/>
+        <w:t>7️</w:t>
+      </w:r>
+      <w:r>
+        <w:rPr>
+          <w:rFonts w:ascii="Tahoma" w:hAnsi="Tahoma" w:cs="Tahoma"/>
+        </w:rPr>
+        <w:t>⃣</w:t>
+      </w:r>
+      <w:r>
+        <w:t xml:space="preserve"> </w:t>
+      </w:r>
+      <w:proofErr w:type="spellStart"/>
+      <w:r>
+        <w:t>MarksRepository</w:t>
+      </w:r>
+      <w:proofErr w:type="spellEnd"/>
+      <w:r>
+        <w:br/>
+        <w:t>8️</w:t>
+      </w:r>
+      <w:r>
+        <w:rPr>
+          <w:rFonts w:ascii="Tahoma" w:hAnsi="Tahoma" w:cs="Tahoma"/>
+        </w:rPr>
+        <w:t>⃣</w:t>
+      </w:r>
+      <w:r>
+        <w:t xml:space="preserve"> </w:t>
+      </w:r>
+      <w:proofErr w:type="spellStart"/>
+      <w:r>
+        <w:t>AttendanceRepository</w:t>
+      </w:r>
+      <w:proofErr w:type="spellEnd"/>
+    </w:p>
+    <w:p>
+      <w:pPr>
+        <w:pStyle w:val="NormalWeb"/>
+      </w:pPr>
+    </w:p>
+    <w:p>
+      <w:pPr>
+        <w:pStyle w:val="NormalWeb"/>
+      </w:pPr>
+    </w:p>
+    <w:p>
+      <w:pPr>
+        <w:pStyle w:val="NormalWeb"/>
+      </w:pPr>
+      <w:r>
+        <w:t>Admin dashboard Working:</w:t>
+      </w:r>
+    </w:p>
+    <w:p>
+      <w:pPr>
+        <w:pStyle w:val="Heading1"/>
+      </w:pPr>
+      <w:r>
+        <w:t>Admin Menu Design (Very Important)</w:t>
+      </w:r>
+    </w:p>
+    <w:p>
+      <w:pPr>
+        <w:pStyle w:val="NormalWeb"/>
+      </w:pPr>
+      <w:r>
+        <w:t>Once admin logs in, show menu:</w:t>
+      </w:r>
+    </w:p>
+    <w:p>
+      <w:pPr>
+        <w:pStyle w:val="HTMLPreformatted"/>
+      </w:pPr>
+      <w:r>
+        <w:t>========= ADMIN DASHBOARD =========</w:t>
+      </w:r>
+      <w:r>
+        <w:br/>
+      </w:r>
+      <w:r>
+        <w:br/>
+        <w:t>1. Manage Departments</w:t>
+      </w:r>
+      <w:r>
+        <w:br/>
+        <w:t>2. Manage Courses</w:t>
+      </w:r>
+      <w:r>
+        <w:br/>
+        <w:t>3. Manage Semesters</w:t>
+      </w:r>
+      <w:r>
+        <w:br/>
+        <w:t>4. Manage Students</w:t>
+      </w:r>
+      <w:r>
+        <w:br/>
+        <w:t>5. Manage Faculty</w:t>
+      </w:r>
+      <w:r>
+        <w:br/>
+        <w:t>6. Exit</w:t>
+      </w:r>
+    </w:p>
+    <w:p>
+      <w:r>
+        <w:pict>
+          <v:rect id="_x0000_i1030" style="width:0;height:1.5pt" o:hralign="center" o:hrstd="t" o:hr="t" fillcolor="#a0a0a0" stroked="f"/>
+        </w:pict>
+      </w:r>
+    </w:p>
+    <w:p>
+      <w:pPr>
+        <w:pStyle w:val="Heading1"/>
+      </w:pPr>
+      <w:r>
+        <w:t>🏫 Department Menu</w:t>
+      </w:r>
+    </w:p>
+    <w:p>
+      <w:pPr>
+        <w:pStyle w:val="HTMLPreformatted"/>
+      </w:pPr>
+      <w:r>
+        <w:t>1. Add Department</w:t>
+      </w:r>
+      <w:r>
+        <w:br/>
+        <w:t>2. Edit Department</w:t>
+      </w:r>
+      <w:r>
+        <w:br/>
+        <w:t>3. Delete Department</w:t>
+      </w:r>
+      <w:r>
+        <w:br/>
+        <w:t xml:space="preserve">4. </w:t>
+      </w:r>
+      <w:proofErr w:type="gramStart"/>
+      <w:r>
+        <w:t>View Departments</w:t>
+      </w:r>
+      <w:r>
+        <w:br/>
+        <w:t>5.</w:t>
+      </w:r>
+      <w:proofErr w:type="gramEnd"/>
+      <w:r>
+        <w:t xml:space="preserve"> Back</w:t>
+      </w:r>
+    </w:p>
+    <w:p>
+      <w:r>
+        <w:pict>
+          <v:rect id="_x0000_i1031" style="width:0;height:1.5pt" o:hralign="center" o:hrstd="t" o:hr="t" fillcolor="#a0a0a0" stroked="f"/>
+        </w:pict>
+      </w:r>
+    </w:p>
+    <w:p>
+      <w:pPr>
+        <w:pStyle w:val="Heading1"/>
+      </w:pPr>
+      <w:r>
+        <w:t>📚 Course Menu</w:t>
+      </w:r>
+    </w:p>
+    <w:p>
+      <w:pPr>
+        <w:pStyle w:val="HTMLPreformatted"/>
+      </w:pPr>
+      <w:r>
+        <w:t>1. Add Course</w:t>
+      </w:r>
+      <w:r>
+        <w:br/>
+        <w:t>2. Edit Course</w:t>
+      </w:r>
+      <w:r>
+        <w:br/>
+        <w:t>3. Delete Course</w:t>
+      </w:r>
+      <w:r>
+        <w:br/>
+        <w:t>4. View Courses</w:t>
+      </w:r>
+      <w:r>
+        <w:br/>
+        <w:t>5. Back</w:t>
+      </w:r>
+    </w:p>
+    <w:p>
+      <w:r>
+        <w:lastRenderedPageBreak/>
+        <w:pict>
+          <v:rect id="_x0000_i1032" style="width:0;height:1.5pt" o:hralign="center" o:hrstd="t" o:hr="t" fillcolor="#a0a0a0" stroked="f"/>
+        </w:pict>
+      </w:r>
+    </w:p>
+    <w:p>
+      <w:pPr>
+        <w:pStyle w:val="Heading1"/>
+      </w:pPr>
+      <w:r>
+        <w:t>🎓 Student Menu</w:t>
+      </w:r>
+    </w:p>
+    <w:p>
+      <w:pPr>
+        <w:pStyle w:val="HTMLPreformatted"/>
+      </w:pPr>
+      <w:r>
+        <w:t>1. Add Student</w:t>
+      </w:r>
+      <w:r>
+        <w:br/>
+        <w:t>2. Update Student</w:t>
+      </w:r>
+      <w:r>
+        <w:br/>
+        <w:t>3. Delete Student</w:t>
+      </w:r>
+      <w:r>
+        <w:br/>
+        <w:t>4. View Students</w:t>
+      </w:r>
+      <w:r>
+        <w:br/>
+        <w:t>5. Back</w:t>
+      </w:r>
+    </w:p>
+    <w:p>
+      <w:r>
+        <w:pict>
+          <v:rect id="_x0000_i1033" style="width:0;height:1.5pt" o:hralign="center" o:hrstd="t" o:hr="t" fillcolor="#a0a0a0" stroked="f"/>
+        </w:pict>
+      </w:r>
+    </w:p>
+    <w:p>
+      <w:pPr>
+        <w:pStyle w:val="Heading1"/>
+      </w:pPr>
+      <w:r>
+        <w:t>👨‍🏫 Faculty Menu</w:t>
+      </w:r>
+    </w:p>
+    <w:p>
+      <w:pPr>
+        <w:pStyle w:val="HTMLPreformatted"/>
+      </w:pPr>
+      <w:r>
+        <w:t>1. Add Faculty</w:t>
+      </w:r>
+      <w:r>
+        <w:br/>
+        <w:t>2. Update Faculty</w:t>
+      </w:r>
+      <w:r>
+        <w:br/>
+        <w:t>3. Delete Faculty</w:t>
+      </w:r>
+      <w:r>
+        <w:br/>
+        <w:t>4. View Faculty</w:t>
+      </w:r>
+      <w:r>
+        <w:br/>
+        <w:t>5. Back</w:t>
+      </w:r>
+    </w:p>
+    <w:p>
+      <w:r>
+        <w:pict>
+          <v:rect id="_x0000_i1034" style="width:0;height:1.5pt" o:hralign="center" o:hrstd="t" o:hr="t" fillcolor="#a0a0a0" stroked="f"/>
+        </w:pict>
+      </w:r>
+    </w:p>
+    <w:p>
+      <w:pPr>
+        <w:pStyle w:val="Heading1"/>
+      </w:pPr>
+      <w:r>
+        <w:t>📊 Clean Flow of the Whole System</w:t>
+      </w:r>
+    </w:p>
+    <w:p>
+      <w:pPr>
+        <w:pStyle w:val="HTMLPreformatted"/>
+      </w:pPr>
+      <w:r>
+        <w:t>Main</w:t>
+      </w:r>
+      <w:r>
+        <w:br/>
+        <w:t xml:space="preserve">  ↓</w:t>
+      </w:r>
+      <w:r>
+        <w:br/>
+        <w:t>Admin Login</w:t>
+      </w:r>
+      <w:r>
+        <w:br/>
+        <w:t xml:space="preserve">  ↓</w:t>
+      </w:r>
+      <w:r>
+        <w:br/>
+        <w:t>Admin Dashboard</w:t>
+      </w:r>
+      <w:r>
+        <w:br/>
+        <w:t xml:space="preserve">  ↓</w:t>
+      </w:r>
+      <w:r>
+        <w:br/>
+        <w:t>Department Management</w:t>
+      </w:r>
+      <w:r>
+        <w:br/>
+        <w:t xml:space="preserve">  ↓</w:t>
+      </w:r>
+      <w:r>
+        <w:br/>
+        <w:t>Course Management</w:t>
+      </w:r>
+      <w:r>
+        <w:br/>
+        <w:t xml:space="preserve">  ↓</w:t>
+      </w:r>
+      <w:r>
+        <w:br/>
+        <w:t>Semester Management</w:t>
+      </w:r>
+      <w:r>
+        <w:br/>
+        <w:t xml:space="preserve">  ↓</w:t>
+      </w:r>
+      <w:r>
+        <w:br/>
+        <w:t>Student Management</w:t>
+      </w:r>
+      <w:r>
+        <w:br/>
+        <w:t xml:space="preserve">  ↓</w:t>
+      </w:r>
+      <w:r>
+        <w:br/>
+        <w:t>Faculty Management</w:t>
+      </w:r>
+    </w:p>
+    <w:p>
+      <w:pPr>
+        <w:pStyle w:val="NormalWeb"/>
+      </w:pPr>
+      <w:r>
+        <w:t xml:space="preserve">Admin builds the </w:t>
+      </w:r>
+      <w:r>
+        <w:rPr>
+          <w:rStyle w:val="Strong"/>
+        </w:rPr>
+        <w:t>academic hierarchy</w:t>
+      </w:r>
+      <w:r>
+        <w:t>.</w:t>
+      </w:r>
+    </w:p>
+    <w:p>
+      <w:r>
+        <w:pict>
+          <v:rect id="_x0000_i1035" style="width:0;height:1.5pt" o:hralign="center" o:hrstd="t" o:hr="t" fillcolor="#a0a0a0" stroked="f"/>
+        </w:pict>
+      </w:r>
+    </w:p>
+    <w:p>
+      <w:pPr>
+        <w:pStyle w:val="Heading1"/>
+      </w:pPr>
+      <w:r>
+        <w:t>⭐ Important Advice (Architecture Improvement)</w:t>
+      </w:r>
+    </w:p>
+    <w:p>
+      <w:pPr>
+        <w:pStyle w:val="NormalWeb"/>
+      </w:pPr>
+      <w:r>
+        <w:t>Your current idea:</w:t>
+      </w:r>
+    </w:p>
+    <w:p>
+      <w:pPr>
+        <w:pStyle w:val="HTMLPreformatted"/>
+      </w:pPr>
+      <w:r>
+        <w:t>Department</w:t>
+      </w:r>
+      <w:r>
+        <w:br/>
+        <w:t xml:space="preserve">   └ Course</w:t>
+      </w:r>
+      <w:r>
+        <w:br/>
+      </w:r>
+      <w:r>
+        <w:lastRenderedPageBreak/>
+        <w:t xml:space="preserve">       └ Faculty</w:t>
+      </w:r>
+      <w:r>
+        <w:br/>
+        <w:t xml:space="preserve">           └ Semester</w:t>
+      </w:r>
+      <w:r>
+        <w:br/>
+        <w:t xml:space="preserve">               └ Student</w:t>
+      </w:r>
+    </w:p>
+    <w:p>
+      <w:pPr>
+        <w:pStyle w:val="NormalWeb"/>
+      </w:pPr>
+      <w:r>
+        <w:t xml:space="preserve">This is </w:t>
+      </w:r>
+      <w:r>
+        <w:rPr>
+          <w:rStyle w:val="Strong"/>
+        </w:rPr>
+        <w:t>not ideal</w:t>
+      </w:r>
+      <w:r>
+        <w:t>.</w:t>
+      </w:r>
+    </w:p>
+    <w:p>
+      <w:pPr>
+        <w:pStyle w:val="NormalWeb"/>
+      </w:pPr>
+      <w:r>
+        <w:t>Better structure:</w:t>
+      </w:r>
+    </w:p>
+    <w:p>
+      <w:pPr>
+        <w:pStyle w:val="HTMLPreformatted"/>
+      </w:pPr>
+      <w:r>
+        <w:t>Department</w:t>
+      </w:r>
+      <w:r>
+        <w:br/>
+        <w:t xml:space="preserve">   └ Course</w:t>
+      </w:r>
+      <w:r>
+        <w:br/>
+        <w:t xml:space="preserve">       └ Semester</w:t>
+      </w:r>
+      <w:r>
+        <w:br/>
+        <w:t xml:space="preserve">            ├ Subjects</w:t>
+      </w:r>
+      <w:r>
+        <w:br/>
+        <w:t xml:space="preserve">            ├ Students</w:t>
+      </w:r>
+      <w:r>
+        <w:br/>
+        <w:t xml:space="preserve">            └ Faculty</w:t>
+      </w:r>
+    </w:p>
+    <w:p>
+      <w:pPr>
+        <w:pStyle w:val="NormalWeb"/>
+      </w:pPr>
+      <w:r>
+        <w:t xml:space="preserve">Faculty usually </w:t>
+      </w:r>
+      <w:r>
+        <w:rPr>
+          <w:rStyle w:val="Strong"/>
+        </w:rPr>
+        <w:t>teach subjects</w:t>
+      </w:r>
+      <w:r>
+        <w:t>, not courses directly.</w:t>
+      </w:r>
+    </w:p>
+    <w:p>
+      <w:pPr>
+        <w:pStyle w:val="NormalWeb"/>
+      </w:pPr>
       <w:bookmarkStart w:id="0" w:name="_GoBack"/>
       <w:bookmarkEnd w:id="0"/>
     </w:p>

</xml_diff>